<commit_message>
Exit ticket 1 updated
</commit_message>
<xml_diff>
--- a/quizzes_exit_tickets/Week01_ExitTicket.docx
+++ b/quizzes_exit_tickets/Week01_ExitTicket.docx
@@ -1415,6 +1415,305 @@
           <w:rFonts w:eastAsiaTheme="minorEastAsia"/>
         </w:rPr>
         <w:lastRenderedPageBreak/>
+        <w:t>The core reason: sinusoids are eigenfunctions of LTI systems</w:t>
+      </w:r>
+      <w:r>
+        <w:rPr>
+          <w:rFonts w:eastAsiaTheme="minorEastAsia"/>
+        </w:rPr>
+        <w:t>.</w:t>
+      </w:r>
+    </w:p>
+    <w:p>
+      <w:pPr>
+        <w:rPr>
+          <w:rFonts w:eastAsiaTheme="minorEastAsia"/>
+        </w:rPr>
+      </w:pPr>
+      <w:r>
+        <w:rPr>
+          <w:rFonts w:eastAsiaTheme="minorEastAsia"/>
+          <w:b/>
+          <w:bCs/>
+        </w:rPr>
+        <w:t>Linearity</w:t>
+      </w:r>
+      <w:r>
+        <w:rPr>
+          <w:rFonts w:eastAsiaTheme="minorEastAsia"/>
+        </w:rPr>
+        <w:t xml:space="preserve"> is what lets you factor </w:t>
+      </w:r>
+      <m:oMath>
+        <m:sSup>
+          <m:sSupPr>
+            <m:ctrlPr>
+              <w:rPr>
+                <w:rFonts w:ascii="Cambria Math" w:eastAsiaTheme="minorEastAsia" w:hAnsi="Cambria Math"/>
+              </w:rPr>
+            </m:ctrlPr>
+          </m:sSupPr>
+          <m:e>
+            <m:r>
+              <w:rPr>
+                <w:rFonts w:ascii="Cambria Math" w:eastAsiaTheme="minorEastAsia" w:hAnsi="Cambria Math"/>
+              </w:rPr>
+              <m:t>e</m:t>
+            </m:r>
+          </m:e>
+          <m:sup>
+            <m:r>
+              <w:rPr>
+                <w:rFonts w:ascii="Cambria Math" w:eastAsiaTheme="minorEastAsia" w:hAnsi="Cambria Math"/>
+              </w:rPr>
+              <m:t>jω</m:t>
+            </m:r>
+            <m:r>
+              <w:rPr>
+                <w:rFonts w:ascii="Cambria Math" w:eastAsiaTheme="minorEastAsia" w:hAnsi="Cambria Math"/>
+              </w:rPr>
+              <m:t>n</m:t>
+            </m:r>
+          </m:sup>
+        </m:sSup>
+      </m:oMath>
+      <w:r>
+        <w:rPr>
+          <w:rFonts w:eastAsiaTheme="minorEastAsia"/>
+        </w:rPr>
+        <w:t xml:space="preserve"> out and lets superposition apply — the output at frequency </w:t>
+      </w:r>
+      <m:oMath>
+        <m:r>
+          <w:rPr>
+            <w:rFonts w:ascii="Cambria Math" w:eastAsiaTheme="minorEastAsia" w:hAnsi="Cambria Math"/>
+          </w:rPr>
+          <m:t>ω</m:t>
+        </m:r>
+      </m:oMath>
+      <w:r>
+        <w:rPr>
+          <w:rFonts w:eastAsiaTheme="minorEastAsia"/>
+        </w:rPr>
+        <w:t xml:space="preserve"> depends only on the input at frequency </w:t>
+      </w:r>
+      <m:oMath>
+        <m:r>
+          <w:rPr>
+            <w:rFonts w:ascii="Cambria Math" w:eastAsiaTheme="minorEastAsia" w:hAnsi="Cambria Math"/>
+          </w:rPr>
+          <m:t>ω</m:t>
+        </m:r>
+      </m:oMath>
+      <w:r>
+        <w:rPr>
+          <w:rFonts w:eastAsiaTheme="minorEastAsia"/>
+        </w:rPr>
+        <w:t>, not on cross-terms mixing different frequencies together</w:t>
+      </w:r>
+      <w:r>
+        <w:rPr>
+          <w:rFonts w:eastAsiaTheme="minorEastAsia"/>
+        </w:rPr>
+        <w:t>.</w:t>
+      </w:r>
+    </w:p>
+    <w:p>
+      <w:pPr>
+        <w:rPr>
+          <w:rFonts w:eastAsiaTheme="minorEastAsia"/>
+        </w:rPr>
+      </w:pPr>
+      <w:r>
+        <w:rPr>
+          <w:rFonts w:eastAsiaTheme="minorEastAsia"/>
+          <w:b/>
+          <w:bCs/>
+        </w:rPr>
+        <w:t>Time-invariance</w:t>
+      </w:r>
+      <w:r>
+        <w:rPr>
+          <w:rFonts w:eastAsiaTheme="minorEastAsia"/>
+        </w:rPr>
+        <w:t xml:space="preserve"> is what makes </w:t>
+      </w:r>
+      <m:oMath>
+        <m:r>
+          <w:rPr>
+            <w:rFonts w:ascii="Cambria Math" w:eastAsiaTheme="minorEastAsia" w:hAnsi="Cambria Math"/>
+          </w:rPr>
+          <m:t>H</m:t>
+        </m:r>
+        <m:d>
+          <m:dPr>
+            <m:ctrlPr>
+              <w:rPr>
+                <w:rFonts w:ascii="Cambria Math" w:eastAsiaTheme="minorEastAsia" w:hAnsi="Cambria Math"/>
+              </w:rPr>
+            </m:ctrlPr>
+          </m:dPr>
+          <m:e>
+            <m:sSup>
+              <m:sSupPr>
+                <m:ctrlPr>
+                  <w:rPr>
+                    <w:rFonts w:ascii="Cambria Math" w:eastAsiaTheme="minorEastAsia" w:hAnsi="Cambria Math"/>
+                    <w:i/>
+                  </w:rPr>
+                </m:ctrlPr>
+              </m:sSupPr>
+              <m:e>
+                <m:r>
+                  <w:rPr>
+                    <w:rFonts w:ascii="Cambria Math" w:eastAsiaTheme="minorEastAsia" w:hAnsi="Cambria Math"/>
+                  </w:rPr>
+                  <m:t>e</m:t>
+                </m:r>
+              </m:e>
+              <m:sup>
+                <m:r>
+                  <w:rPr>
+                    <w:rFonts w:ascii="Cambria Math" w:eastAsiaTheme="minorEastAsia" w:hAnsi="Cambria Math"/>
+                  </w:rPr>
+                  <m:t>j</m:t>
+                </m:r>
+                <m:r>
+                  <w:rPr>
+                    <w:rFonts w:ascii="Cambria Math" w:eastAsiaTheme="minorEastAsia" w:hAnsi="Cambria Math"/>
+                  </w:rPr>
+                  <m:t>ω</m:t>
+                </m:r>
+              </m:sup>
+            </m:sSup>
+          </m:e>
+        </m:d>
+      </m:oMath>
+      <w:r>
+        <w:rPr>
+          <w:rFonts w:eastAsiaTheme="minorEastAsia"/>
+        </w:rPr>
+        <w:t xml:space="preserve"> a constant instead of a function of </w:t>
+      </w:r>
+      <m:oMath>
+        <m:r>
+          <w:rPr>
+            <w:rFonts w:ascii="Cambria Math" w:eastAsiaTheme="minorEastAsia" w:hAnsi="Cambria Math"/>
+          </w:rPr>
+          <m:t>n</m:t>
+        </m:r>
+      </m:oMath>
+      <w:r>
+        <w:rPr>
+          <w:rFonts w:eastAsiaTheme="minorEastAsia"/>
+        </w:rPr>
+        <w:t>.</w:t>
+      </w:r>
+      <w:r>
+        <w:rPr>
+          <w:rFonts w:eastAsiaTheme="minorEastAsia"/>
+        </w:rPr>
+        <w:t xml:space="preserve"> If the system's parameters changed with time, </w:t>
+      </w:r>
+      <m:oMath>
+        <m:r>
+          <w:rPr>
+            <w:rFonts w:ascii="Cambria Math" w:eastAsiaTheme="minorEastAsia" w:hAnsi="Cambria Math"/>
+          </w:rPr>
+          <m:t>h</m:t>
+        </m:r>
+      </m:oMath>
+      <w:r>
+        <w:rPr>
+          <w:rFonts w:eastAsiaTheme="minorEastAsia"/>
+        </w:rPr>
+        <w:t xml:space="preserve"> would depend on both </w:t>
+      </w:r>
+      <m:oMath>
+        <m:r>
+          <w:rPr>
+            <w:rFonts w:ascii="Cambria Math" w:eastAsiaTheme="minorEastAsia" w:hAnsi="Cambria Math"/>
+          </w:rPr>
+          <m:t>n</m:t>
+        </m:r>
+      </m:oMath>
+      <w:r>
+        <w:rPr>
+          <w:rFonts w:eastAsiaTheme="minorEastAsia"/>
+        </w:rPr>
+        <w:t xml:space="preserve"> and </w:t>
+      </w:r>
+      <m:oMath>
+        <m:r>
+          <w:rPr>
+            <w:rFonts w:ascii="Cambria Math" w:eastAsiaTheme="minorEastAsia" w:hAnsi="Cambria Math"/>
+          </w:rPr>
+          <m:t>k</m:t>
+        </m:r>
+      </m:oMath>
+      <w:r>
+        <w:rPr>
+          <w:rFonts w:eastAsiaTheme="minorEastAsia"/>
+        </w:rPr>
+        <w:t xml:space="preserve">, and the </w:t>
+      </w:r>
+      <m:oMath>
+        <m:sSup>
+          <m:sSupPr>
+            <m:ctrlPr>
+              <w:rPr>
+                <w:rFonts w:ascii="Cambria Math" w:eastAsiaTheme="minorEastAsia" w:hAnsi="Cambria Math"/>
+              </w:rPr>
+            </m:ctrlPr>
+          </m:sSupPr>
+          <m:e>
+            <m:r>
+              <w:rPr>
+                <w:rFonts w:ascii="Cambria Math" w:eastAsiaTheme="minorEastAsia" w:hAnsi="Cambria Math"/>
+              </w:rPr>
+              <m:t>e</m:t>
+            </m:r>
+          </m:e>
+          <m:sup>
+            <m:r>
+              <w:rPr>
+                <w:rFonts w:ascii="Cambria Math" w:eastAsiaTheme="minorEastAsia" w:hAnsi="Cambria Math"/>
+              </w:rPr>
+              <m:t>jω</m:t>
+            </m:r>
+            <m:r>
+              <w:rPr>
+                <w:rFonts w:ascii="Cambria Math" w:eastAsiaTheme="minorEastAsia" w:hAnsi="Cambria Math"/>
+              </w:rPr>
+              <m:t>n</m:t>
+            </m:r>
+          </m:sup>
+        </m:sSup>
+      </m:oMath>
+      <w:r>
+        <w:rPr>
+          <w:rFonts w:eastAsiaTheme="minorEastAsia"/>
+        </w:rPr>
+        <w:t xml:space="preserve"> term wouldn't factor cleanly out of the integral</w:t>
+      </w:r>
+    </w:p>
+    <w:p>
+      <w:pPr>
+        <w:rPr>
+          <w:rFonts w:eastAsiaTheme="minorEastAsia"/>
+        </w:rPr>
+      </w:pPr>
+    </w:p>
+    <w:p>
+      <w:pPr>
+        <w:rPr>
+          <w:rFonts w:eastAsiaTheme="minorEastAsia"/>
+        </w:rPr>
+      </w:pPr>
+      <w:r>
+        <w:rPr>
+          <w:rFonts w:eastAsiaTheme="minorEastAsia"/>
+        </w:rPr>
         <w:t xml:space="preserve">A good exit ticket answer should be short, correct, to the point and demonstrate a well-reasoned understanding of the question being asked. Exit ticket answers will be graded </w:t>
       </w:r>
       <w:r>

</xml_diff>